<commit_message>
Add admin and delivery implementation files
Commit remaining backend/admin route updates, upload assets, helper scripts, and delivery backend/dashboard project files from the working tree.

Co-authored-by: Copilot <223556219+Copilot@users.noreply.github.com>
</commit_message>
<xml_diff>
--- a/Structure du projet Alia.docx
+++ b/Structure du projet Alia.docx
@@ -2425,6 +2425,79 @@
     <w:p>
       <w:r>
         <w:t>PROJECT_NAME=Alia</w:t>
+      </w:r>
+    </w:p>
+    <w:p/>
+    <w:p/>
+    <w:p>
+      <w:r>
+        <w:t>git checkout main</w:t>
+      </w:r>
+    </w:p>
+    <w:p>
+      <w:r>
+        <w:t>git pull</w:t>
+      </w:r>
+    </w:p>
+    <w:p>
+      <w:r>
+        <w:t>git merge add-dashboard-merchant-endpoints</w:t>
+      </w:r>
+    </w:p>
+    <w:p/>
+    <w:p/>
+    <w:p/>
+    <w:p/>
+    <w:p/>
+    <w:p>
+      <w:pPr>
+        <w:rPr>
+          <w:lang w:val="fr-FR"/>
+        </w:rPr>
+      </w:pPr>
+      <w:r>
+        <w:rPr>
+          <w:lang w:val="fr-FR"/>
+        </w:rPr>
+        <w:t>REM Reviens à la racine du projet</w:t>
+      </w:r>
+    </w:p>
+    <w:p>
+      <w:pPr>
+        <w:rPr>
+          <w:lang w:val="fr-FR"/>
+        </w:rPr>
+      </w:pPr>
+      <w:r>
+        <w:rPr>
+          <w:lang w:val="fr-FR"/>
+        </w:rPr>
+        <w:t xml:space="preserve">cd.. </w:t>
+      </w:r>
+    </w:p>
+    <w:p>
+      <w:pPr>
+        <w:rPr>
+          <w:lang w:val="fr-FR"/>
+        </w:rPr>
+      </w:pPr>
+    </w:p>
+    <w:p>
+      <w:pPr>
+        <w:rPr>
+          <w:lang w:val="fr-FR"/>
+        </w:rPr>
+      </w:pPr>
+      <w:r>
+        <w:rPr>
+          <w:lang w:val="fr-FR"/>
+        </w:rPr>
+        <w:t>REM Lance Docker Compose (ça va build et démarrer tout)</w:t>
+      </w:r>
+    </w:p>
+    <w:p>
+      <w:r>
+        <w:t>docker-compose up --build</w:t>
       </w:r>
     </w:p>
     <w:sectPr>

</xml_diff>